<commit_message>
feat: FMI por cuenta y poder sin datos PH/resoluciones
Quita del PODER.docx y del contexto docxtpl dirección/tel/email PH,
resoluciones de nombramiento RL y lugar de expedición de cédula.
Añade input FMI por fila en el preview de certificados y lo envía
como fmi_por_indice al generar (vacío permitido, se omite en Word).

Co-authored-by: ParedesD28 <ParedesD28@users.noreply.github.com>
</commit_message>
<xml_diff>
--- a/static/plantillas/PODER.docx
+++ b/static/plantillas/PODER.docx
@@ -132,7 +132,7 @@
           <w:b w:val="0"/>
           <w:sz w:val="20"/>
         </w:rPr>
-        <w:t>{{ representante_nombre }}, mayor de edad y vecino de la ciudad de {{ ciudad }}, identificad{{ representante_genero }} con cédula de ciudadanía número {{ representante_cedula }}{% if representante_cedula_expedida_en %} expedida en la ciudad de {{ representante_cedula_expedida_en }}{% endif %}, en mi calidad de Representante Legal y administrador{% if resolucion_numero %} conforme se acredita en la Resolución número {{ resolucion_numero }}{% if resolucion_fecha %} del {{ resolucion_fecha }}{% endif %}{% if resolucion_autoridad %}, expedida por {{ resolucion_autoridad }}{% endif %}{% else %} conforme se acredita en la Resolución número ________ del ________{% endif %}, de la {{ ejecutante_nombre }} PROPIEDAD HORIZONTAL, legalmente constituido e inscrito con N.I.T.: {{ ejecutante_nit }} y domicilio principal en la ciudad de {{ ciudad }}{% if copropiedad_direccion %}, en la {{ copropiedad_direccion }}{% endif %}{% if copropiedad_telefono %} TELEFONO {{ copropiedad_telefono }}{% endif %}{% if copropiedad_email %}. EMAIL DE NOTIFICACIÓN JUDICIAL: {{ copropiedad_email }}{% endif %}{% if resolucion2_numero %} conforme se acredita en la Resolución número {{ resolucion2_numero }}{% if resolucion2_fecha %} del {{ resolucion2_fecha }}{% endif %}{% if resolucion2_autoridad %}, expedida por {{ resolucion2_autoridad }}{% endif %}{% endif %}, respetuosamente manifiesto a usted que a través del presente escrito CONFIERO PODER ESPECIAL AMPLIO Y SUFICIENTE al doctor {{ apoderado_nombre }} mayor de edad y vecino de la ciudad de {{ apoderado_ciudad }}. EMAIL DE NOTIFICACIÓN JUDICIAL: {{ apoderado_email }} (correo que corresponde al registrado en el registro nacional de abogados, de conformidad con la Ley 2213 de junio de 2022, Artículo 5 Inciso 2), identificado con la cédula de ciudadanía No. {{ apoderado_cedula }} portador de la L.T No. {{ apoderado_lt }} del Consejo Superior de la Judicatura, para que inicie, tramite y lleve hasta su terminación Proceso Ejecutivo de mínima cuantía contra {{ ejecutados_proceso }}, propietario{% if hay_varios_propietarios %}s{% endif %} del inmueble {{ torre_apto }}{% if fmi %} identificado con el FMI {{ fmi }}{% endif %}, para que se libre mandamiento de pago a favor del {{ ejecutante_nombre }} PH., y a cargo del deudor {{ deudor_mandamiento }}, con el fin de obtener el pago por concepto de capital de las CUOTAS ORDINARIAS y EXTRAORDINARIAS causadas desde el mes de {{ periodo_desde }} y hasta {{ periodo_hasta }}, las que se causen en lo sucesivo, así como los intereses moratorios desde que se hicieron exigibles hasta que se verifique el pago total de las obligaciones, las costas del proceso y las agencias en derecho.</w:t>
+        <w:t>{{ representante_nombre }}, mayor de edad y vecino de la ciudad de {{ ciudad }}, identificad{{ representante_genero }} con cédula de ciudadanía número {{ representante_cedula }}, en mi calidad de Representante Legal y administrador de la {{ ejecutante_nombre }} PROPIEDAD HORIZONTAL, legalmente constituido e inscrito con N.I.T.: {{ ejecutante_nit }} y domicilio principal en la ciudad de {{ ciudad }}, respetuosamente manifiesto a usted que a través del presente escrito CONFIERO PODER ESPECIAL AMPLIO Y SUFICIENTE al doctor {{ apoderado_nombre }} mayor de edad y vecino de la ciudad de {{ apoderado_ciudad }}. EMAIL DE NOTIFICACIÓN JUDICIAL: {{ apoderado_email }} (correo que corresponde al registrado en el registro nacional de abogados, de conformidad con la Ley 2213 de junio de 2022, Artículo 5 Inciso 2), identificado con la cédula de ciudadanía No. {{ apoderado_cedula }} portador de la L.T No. {{ apoderado_lt }} del Consejo Superior de la Judicatura, para que inicie, tramite y lleve hasta su terminación Proceso Ejecutivo de mínima cuantía contra {{ ejecutados_proceso }}, propietario{% if hay_varios_propietarios %}s{% endif %} del inmueble {{ torre_apto }}{% if fmi %} identificado con el FMI {{ fmi }}{% endif %}, para que se libre mandamiento de pago a favor del {{ ejecutante_nombre }} PH., y a cargo del deudor {{ deudor_mandamiento }}, con el fin de obtener el pago por concepto de capital de las CUOTAS ORDINARIAS y EXTRAORDINARIAS causadas desde el mes de {{ periodo_desde }} y hasta {{ periodo_hasta }}, las que se causen en lo sucesivo, así como los intereses moratorios desde que se hicieron exigibles hasta que se verifique el pago total de las obligaciones, las costas del proceso y las agencias en derecho.</w:t>
       </w:r>
     </w:p>
     <w:p>
@@ -200,7 +200,7 @@
           <w:b w:val="0"/>
           <w:sz w:val="20"/>
         </w:rPr>
-        <w:t>C.C. {{ representante_cedula }}{% if representante_cedula_expedida_en %} expedida en la ciudad de {{ representante_cedula_expedida_en }}{% endif %}</w:t>
+        <w:t>C.C. {{ representante_cedula }}</w:t>
       </w:r>
     </w:p>
     <w:p/>

</xml_diff>